<commit_message>
S Table 4: move std-pop trade-off to reviewer Q&A; supplement notes verified
- Supplementary Table 4: trimmed the standard-population note to the essential
  column explanation (2000 US standard unless flagged; ratio cancels the
  standard). Moved the detailed Black receptor-subtype trade-off (Davis Lynn
  2025 Segi-world+NHW vs Gleason 2012 2000US+unstratified-White) to
  Reviewer_QA.md as Q8b.
- Re-scanned all supplementary note prose: no internal scaffolding, no
  robustness overclaim (the only 'stable' is the JBI item 'stable age-adjusted
  rate'), no first-person/loaded wording.
- Confirmed IRR confidence intervals are intact: 78 of 85 representatives carry
  a CI; the 7 point estimates are where the source reported no variance and none
  was computable (only the Hispanic aggregate SIR among the Table 1 rows).
Rebuilt supplement, QA doc, and zip.
</commit_message>
<xml_diff>
--- a/meta_agents/search_v2/outputs/Reviewer_QA.docx
+++ b/meta_agents/search_v2/outputs/Reviewer_QA.docx
@@ -400,6 +400,54 @@
           <w:szCs w:val="24"/>
         </w:rPr>
         <w:t xml:space="preserve">A. 대표 선정에서 2000 US 표준인구와 최근·긴 기간을 우선했고, 예외(예: 1970 world standard를 쓴 오래된 1편)는 명시했다. 표준인구·기간 차이는 직접 비교를 제한하는 한계로 기술했다. (→ Discussion 한계)</w:t>
+      </w:r>
+    </w:p>
+    <w:p>
+      <w:pPr>
+        <w:pStyle w:val="Heading2"/>
+        <w:keepNext/>
+        <w:spacing w:after="80" w:line="360"/>
+      </w:pPr>
+      <w:r>
+        <w:rPr>
+          <w:rFonts w:ascii="Times New Roman" w:cs="Times New Roman" w:eastAsia="Times New Roman" w:hAnsi="Times New Roman"/>
+          <w:b/>
+          <w:bCs/>
+          <w:sz w:val="24"/>
+          <w:szCs w:val="24"/>
+        </w:rPr>
+        <w:t xml:space="preserve">Q8b. 흑인 수용체-아형 두 셀(HR+/HER2−, HR−/HER2+)의 대표는 2000 US가 아닌 Segi world 표준을 쓴다. 왜 그 estimate를 골랐나?</w:t>
+      </w:r>
+    </w:p>
+    <w:p>
+      <w:pPr>
+        <w:spacing w:after="160" w:line="360"/>
+      </w:pPr>
+      <w:r>
+        <w:rPr>
+          <w:rFonts w:ascii="Times New Roman" w:cs="Times New Roman" w:eastAsia="Times New Roman" w:hAnsi="Times New Roman"/>
+          <w:sz w:val="24"/>
+          <w:szCs w:val="24"/>
+        </w:rPr>
+        <w:t xml:space="preserve">A. 이 두 셀에서는 NHW 비교군과 2000 US 표준을 동시에 만족하는 연구가 없었다. 대표로 쓴 Davis Lynn 2025는 NHW 비교군을 갖지만 Segi world 표준이고, 대안인 Gleason 2012는 2000 US 표준이지만 unstratified White 비교군이다. 발생률비는 각 연구 안에서 형성돼 표준인구가 대체로 상쇄되지만 비교군 차이는 참조집단 자체를 바꾸므로, </w:t>
+      </w:r>
+      <w:r>
+        <w:rPr>
+          <w:rFonts w:ascii="Times New Roman" w:cs="Times New Roman" w:eastAsia="Times New Roman" w:hAnsi="Times New Roman"/>
+          <w:b/>
+          <w:bCs/>
+          <w:sz w:val="24"/>
+          <w:szCs w:val="24"/>
+        </w:rPr>
+        <w:t xml:space="preserve">비교군(NHW)을 우선</w:t>
+      </w:r>
+      <w:r>
+        <w:rPr>
+          <w:rFonts w:ascii="Times New Roman" w:cs="Times New Roman" w:eastAsia="Times New Roman" w:hAnsi="Times New Roman"/>
+          <w:sz w:val="24"/>
+          <w:szCs w:val="24"/>
+        </w:rPr>
+        <w:t xml:space="preserve">했다. 비-2000 표준은 Supplementary Table 4의 "Std pop" 열에 표시했다. (→ Supplementary Table 4)</w:t>
       </w:r>
     </w:p>
     <w:p>

</xml_diff>